<commit_message>
init.php: VENDORS apunta a "vendor" (minúscula, como lo crea Composer)
Composer crea la carpeta "vendor" en minúscula y así la usan los sitios.
Con "Vendor" en init.php el autoload solo se encontraba en Windows (sistema
de archivos sin distinción de mayúsculas); en un servidor Linux init.php
lanzaba la excepción de autoload.php no disponible. Manual actualizado.

Co-Authored-By: Claude Opus 5.5 <noreply@anthropic.com>
</commit_message>
<xml_diff>
--- a/MANUAL DE REFERENCIA DE APJ 2.docx
+++ b/MANUAL DE REFERENCIA DE APJ 2.docx
@@ -1571,7 +1571,7 @@
                 <w:sz w:val="19"/>
                 <w:szCs w:val="19"/>
               </w:rPr>
-              <w:t xml:space="preserve">Vendor/autoload.php</w:t>
+              <w:t xml:space="preserve">vendor/autoload.php</w:t>
             </w:r>
             <w:r>
               <w:t xml:space="preserve">)</w:t>
@@ -2072,7 +2072,7 @@
           <w:sz w:val="19"/>
           <w:szCs w:val="19"/>
         </w:rPr>
-        <w:t xml:space="preserve">Vendor/autoload.php</w:t>
+        <w:t xml:space="preserve">vendor/autoload.php</w:t>
       </w:r>
       <w:r>
         <w:t xml:space="preserve">, aunque no use librerías de terceros.</w:t>
@@ -2223,10 +2223,10 @@
           <w:sz w:val="19"/>
           <w:szCs w:val="19"/>
         </w:rPr>
-        <w:t xml:space="preserve">Vendor</w:t>
-      </w:r>
-      <w:r>
-        <w:t xml:space="preserve"> (esta última con su </w:t>
+        <w:t xml:space="preserve">vendor</w:t>
+      </w:r>
+      <w:r>
+        <w:t xml:space="preserve"> (esta última creada por Composer, con su </w:t>
       </w:r>
       <w:r>
         <w:rPr>
@@ -2238,7 +2238,7 @@
         <w:t xml:space="preserve">autoload.php</w:t>
       </w:r>
       <w:r>
-        <w:t xml:space="preserve"> de Composer).</w:t>
+        <w:t xml:space="preserve">).</w:t>
       </w:r>
     </w:p>
     <w:p>
@@ -2335,7 +2335,7 @@
           <w:sz w:val="19"/>
           <w:szCs w:val="19"/>
         </w:rPr>
-        <w:t xml:space="preserve">Vendor/autoload.php</w:t>
+        <w:t xml:space="preserve">vendor/autoload.php</w:t>
       </w:r>
       <w:r>
         <w:t xml:space="preserve">.</w:t>
@@ -4409,7 +4409,7 @@
           <w:szCs w:val="17"/>
         </w:rPr>
         <w:br/>
-        <w:t xml:space="preserve">├── Vendor/           Librerías de Composer (autoload.php)</w:t>
+        <w:t xml:space="preserve">├── vendor/           Librerías de Composer (autoload.php)</w:t>
       </w:r>
       <w:r>
         <w:rPr>
@@ -10778,7 +10778,7 @@
                 <w:sz w:val="19"/>
                 <w:szCs w:val="19"/>
               </w:rPr>
-              <w:t xml:space="preserve">Vendor/autoload.php</w:t>
+              <w:t xml:space="preserve">vendor/autoload.php</w:t>
             </w:r>
             <w:r>
               <w:t xml:space="preserve">.</w:t>

</xml_diff>